<commit_message>
Cập nhật cách đóng gói 1 thư viện để sử dụng sau này
</commit_message>
<xml_diff>
--- a/Cách đóng gói 1 thư viện python.docx
+++ b/Cách đóng gói 1 thư viện python.docx
@@ -3,9 +3,51 @@
 <w:document xmlns:wpc="http://schemas.microsoft.com/office/word/2010/wordprocessingCanvas" xmlns:cx="http://schemas.microsoft.com/office/drawing/2014/chartex" xmlns:cx1="http://schemas.microsoft.com/office/drawing/2015/9/8/chartex" xmlns:cx2="http://schemas.microsoft.com/office/drawing/2015/10/21/chartex" xmlns:cx3="http://schemas.microsoft.com/office/drawing/2016/5/9/chartex" xmlns:cx4="http://schemas.microsoft.com/office/drawing/2016/5/10/chartex" xmlns:cx5="http://schemas.microsoft.com/office/drawing/2016/5/11/chartex" xmlns:cx6="http://schemas.microsoft.com/office/drawing/2016/5/12/chartex" xmlns:cx7="http://schemas.microsoft.com/office/drawing/2016/5/13/chartex" xmlns:cx8="http://schemas.microsoft.com/office/drawing/2016/5/14/chartex" xmlns:mc="http://schemas.openxmlformats.org/markup-compatibility/2006" xmlns:aink="http://schemas.microsoft.com/office/drawing/2016/ink" xmlns:am3d="http://schemas.microsoft.com/office/drawing/2017/model3d" xmlns:o="urn:schemas-microsoft-com:office:office" xmlns:oel="http://schemas.microsoft.com/office/2019/extlst" xmlns:r="http://schemas.openxmlformats.org/officeDocument/2006/relationships" xmlns:m="http://schemas.openxmlformats.org/officeDocument/2006/math" xmlns:v="urn:schemas-microsoft-com:vml" xmlns:wp14="http://schemas.microsoft.com/office/word/2010/wordprocessingDrawing" xmlns:wp="http://schemas.openxmlformats.org/drawingml/2006/wordprocessingDrawing" xmlns:w10="urn:schemas-microsoft-com:office:word" xmlns:w="http://schemas.openxmlformats.org/wordprocessingml/2006/main" xmlns:w14="http://schemas.microsoft.com/office/word/2010/wordml" xmlns:w15="http://schemas.microsoft.com/office/word/2012/wordml" xmlns:w16cex="http://schemas.microsoft.com/office/word/2018/wordml/cex" xmlns:w16cid="http://schemas.microsoft.com/office/word/2016/wordml/cid" xmlns:w16="http://schemas.microsoft.com/office/word/2018/wordml" xmlns:w16du="http://schemas.microsoft.com/office/word/2023/wordml/word16du" xmlns:w16sdtdh="http://schemas.microsoft.com/office/word/2020/wordml/sdtdatahash" xmlns:w16sdtfl="http://schemas.microsoft.com/office/word/2024/wordml/sdtformatlock" xmlns:w16se="http://schemas.microsoft.com/office/word/2015/wordml/symex" xmlns:wpg="http://schemas.microsoft.com/office/word/2010/wordprocessingGroup" xmlns:wpi="http://schemas.microsoft.com/office/word/2010/wordprocessingInk" xmlns:wne="http://schemas.microsoft.com/office/word/2006/wordml" xmlns:wps="http://schemas.microsoft.com/office/word/2010/wordprocessingShape" mc:Ignorable="w14 w15 w16se w16cid w16 w16cex w16sdtdh w16sdtfl w16du wp14">
   <w:body>
     <w:p>
-      <w:r>
-        <w:t>Đây là cấu trúc thư mục</w:t>
-      </w:r>
+      <w:proofErr w:type="spellStart"/>
+      <w:r>
+        <w:t>Đây</w:t>
+      </w:r>
+      <w:proofErr w:type="spellEnd"/>
+      <w:r>
+        <w:t xml:space="preserve"> </w:t>
+      </w:r>
+      <w:proofErr w:type="spellStart"/>
+      <w:r>
+        <w:t>là</w:t>
+      </w:r>
+      <w:proofErr w:type="spellEnd"/>
+      <w:r>
+        <w:t xml:space="preserve"> </w:t>
+      </w:r>
+      <w:proofErr w:type="spellStart"/>
+      <w:r>
+        <w:t>cấu</w:t>
+      </w:r>
+      <w:proofErr w:type="spellEnd"/>
+      <w:r>
+        <w:t xml:space="preserve"> </w:t>
+      </w:r>
+      <w:proofErr w:type="spellStart"/>
+      <w:r>
+        <w:t>trúc</w:t>
+      </w:r>
+      <w:proofErr w:type="spellEnd"/>
+      <w:r>
+        <w:t xml:space="preserve"> </w:t>
+      </w:r>
+      <w:proofErr w:type="spellStart"/>
+      <w:r>
+        <w:t>thư</w:t>
+      </w:r>
+      <w:proofErr w:type="spellEnd"/>
+      <w:r>
+        <w:t xml:space="preserve"> </w:t>
+      </w:r>
+      <w:proofErr w:type="spellStart"/>
+      <w:r>
+        <w:t>mục</w:t>
+      </w:r>
+      <w:proofErr w:type="spellEnd"/>
       <w:r>
         <w:t>:</w:t>
       </w:r>
@@ -13,6 +55,9 @@
     <w:p/>
     <w:p>
       <w:r>
+        <w:rPr>
+          <w:noProof/>
+        </w:rPr>
         <w:drawing>
           <wp:inline distT="0" distB="0" distL="0" distR="0" wp14:anchorId="149B372C" wp14:editId="1CCD2DC4">
             <wp:extent cx="3200847" cy="2810267"/>
@@ -52,11 +97,142 @@
     </w:p>
     <w:p>
       <w:r>
-        <w:t>Thư viện cần copy thì mình đã di chueyenr nó đến vị trí `Code/uhppoted`.  Thư mục này chứa toàn bộ file code</w:t>
+        <w:t xml:space="preserve">Thư </w:t>
+      </w:r>
+      <w:proofErr w:type="spellStart"/>
+      <w:r>
+        <w:t>viện</w:t>
+      </w:r>
+      <w:proofErr w:type="spellEnd"/>
+      <w:r>
+        <w:t xml:space="preserve"> </w:t>
+      </w:r>
+      <w:proofErr w:type="spellStart"/>
+      <w:r>
+        <w:t>cần</w:t>
+      </w:r>
+      <w:proofErr w:type="spellEnd"/>
+      <w:r>
+        <w:t xml:space="preserve"> copy </w:t>
+      </w:r>
+      <w:proofErr w:type="spellStart"/>
+      <w:r>
+        <w:t>thì</w:t>
+      </w:r>
+      <w:proofErr w:type="spellEnd"/>
+      <w:r>
+        <w:t xml:space="preserve"> </w:t>
+      </w:r>
+      <w:proofErr w:type="spellStart"/>
+      <w:r>
+        <w:t>mình</w:t>
+      </w:r>
+      <w:proofErr w:type="spellEnd"/>
+      <w:r>
+        <w:t xml:space="preserve"> </w:t>
+      </w:r>
+      <w:proofErr w:type="spellStart"/>
+      <w:r>
+        <w:t>đã</w:t>
+      </w:r>
+      <w:proofErr w:type="spellEnd"/>
+      <w:r>
+        <w:t xml:space="preserve"> di </w:t>
+      </w:r>
+      <w:proofErr w:type="spellStart"/>
+      <w:r>
+        <w:t>duyển</w:t>
+      </w:r>
+      <w:proofErr w:type="spellEnd"/>
+      <w:r>
+        <w:t xml:space="preserve"> </w:t>
+      </w:r>
+      <w:proofErr w:type="spellStart"/>
+      <w:r>
+        <w:t>nó</w:t>
+      </w:r>
+      <w:proofErr w:type="spellEnd"/>
+      <w:r>
+        <w:t xml:space="preserve"> </w:t>
+      </w:r>
+      <w:proofErr w:type="spellStart"/>
+      <w:r>
+        <w:t>đến</w:t>
+      </w:r>
+      <w:proofErr w:type="spellEnd"/>
+      <w:r>
+        <w:t xml:space="preserve"> </w:t>
+      </w:r>
+      <w:proofErr w:type="spellStart"/>
+      <w:r>
+        <w:t>vị</w:t>
+      </w:r>
+      <w:proofErr w:type="spellEnd"/>
+      <w:r>
+        <w:t xml:space="preserve"> </w:t>
+      </w:r>
+      <w:proofErr w:type="spellStart"/>
+      <w:r>
+        <w:t>trí</w:t>
+      </w:r>
+      <w:proofErr w:type="spellEnd"/>
+      <w:r>
+        <w:t xml:space="preserve"> `Code/</w:t>
+      </w:r>
+      <w:proofErr w:type="spellStart"/>
+      <w:r>
+        <w:t>uhppoted</w:t>
+      </w:r>
+      <w:proofErr w:type="spellEnd"/>
+      <w:r>
+        <w:t xml:space="preserve">`.  Thư </w:t>
+      </w:r>
+      <w:proofErr w:type="spellStart"/>
+      <w:r>
+        <w:t>mục</w:t>
+      </w:r>
+      <w:proofErr w:type="spellEnd"/>
+      <w:r>
+        <w:t xml:space="preserve"> </w:t>
+      </w:r>
+      <w:proofErr w:type="spellStart"/>
+      <w:r>
+        <w:t>này</w:t>
+      </w:r>
+      <w:proofErr w:type="spellEnd"/>
+      <w:r>
+        <w:t xml:space="preserve"> </w:t>
+      </w:r>
+      <w:proofErr w:type="spellStart"/>
+      <w:r>
+        <w:t>chứa</w:t>
+      </w:r>
+      <w:proofErr w:type="spellEnd"/>
+      <w:r>
+        <w:t xml:space="preserve"> </w:t>
+      </w:r>
+      <w:proofErr w:type="spellStart"/>
+      <w:r>
+        <w:t>toàn</w:t>
+      </w:r>
+      <w:proofErr w:type="spellEnd"/>
+      <w:r>
+        <w:t xml:space="preserve"> </w:t>
+      </w:r>
+      <w:proofErr w:type="spellStart"/>
+      <w:r>
+        <w:t>bộ</w:t>
+      </w:r>
+      <w:proofErr w:type="spellEnd"/>
+      <w:r>
+        <w:t xml:space="preserve"> file code</w:t>
       </w:r>
     </w:p>
     <w:p>
       <w:r>
+        <w:rPr>
+          <w:noProof/>
+        </w:rPr>
         <w:lastRenderedPageBreak/>
         <w:drawing>
           <wp:inline distT="0" distB="0" distL="0" distR="0" wp14:anchorId="4D2FAB3A" wp14:editId="07B1E439">
@@ -97,17 +273,188 @@
     </w:p>
     <w:p>
       <w:r>
-        <w:t>Copy từ `Lib/site-packages/uhppoted`. Thư mục `uhppoted-0.8.9.dist-info` chỉ là thư mục chứa thông tin của thư viện, không cần copy.</w:t>
+        <w:t xml:space="preserve">Ta copy </w:t>
+      </w:r>
+      <w:proofErr w:type="spellStart"/>
+      <w:r>
+        <w:t>thư</w:t>
+      </w:r>
+      <w:proofErr w:type="spellEnd"/>
+      <w:r>
+        <w:t xml:space="preserve"> </w:t>
+      </w:r>
+      <w:proofErr w:type="spellStart"/>
+      <w:r>
+        <w:t>mục</w:t>
+      </w:r>
+      <w:proofErr w:type="spellEnd"/>
+      <w:r>
+        <w:t xml:space="preserve"> code </w:t>
+      </w:r>
+      <w:proofErr w:type="spellStart"/>
+      <w:r>
+        <w:t>của</w:t>
+      </w:r>
+      <w:proofErr w:type="spellEnd"/>
+      <w:r>
+        <w:t xml:space="preserve"> </w:t>
+      </w:r>
+      <w:proofErr w:type="spellStart"/>
+      <w:r>
+        <w:t>thư</w:t>
+      </w:r>
+      <w:proofErr w:type="spellEnd"/>
+      <w:r>
+        <w:t xml:space="preserve"> </w:t>
+      </w:r>
+      <w:proofErr w:type="spellStart"/>
+      <w:r>
+        <w:t>viện</w:t>
+      </w:r>
+      <w:proofErr w:type="spellEnd"/>
+      <w:r>
+        <w:t xml:space="preserve"> </w:t>
+      </w:r>
+      <w:proofErr w:type="spellStart"/>
+      <w:r>
+        <w:t>từ</w:t>
+      </w:r>
+      <w:proofErr w:type="spellEnd"/>
+      <w:r>
+        <w:t xml:space="preserve"> `Lib/site-packages/</w:t>
+      </w:r>
+      <w:proofErr w:type="spellStart"/>
+      <w:r>
+        <w:t>uhppoted</w:t>
+      </w:r>
+      <w:proofErr w:type="spellEnd"/>
+      <w:r>
+        <w:t xml:space="preserve">`. Thư </w:t>
+      </w:r>
+      <w:proofErr w:type="spellStart"/>
+      <w:r>
+        <w:t>mục</w:t>
+      </w:r>
+      <w:proofErr w:type="spellEnd"/>
+      <w:r>
+        <w:t xml:space="preserve"> `uhppoted-0.8.9.dist-info` </w:t>
+      </w:r>
+      <w:proofErr w:type="spellStart"/>
+      <w:r>
+        <w:t>chỉ</w:t>
+      </w:r>
+      <w:proofErr w:type="spellEnd"/>
+      <w:r>
+        <w:t xml:space="preserve"> </w:t>
+      </w:r>
+      <w:proofErr w:type="spellStart"/>
+      <w:r>
+        <w:t>là</w:t>
+      </w:r>
+      <w:proofErr w:type="spellEnd"/>
+      <w:r>
+        <w:t xml:space="preserve"> </w:t>
+      </w:r>
+      <w:proofErr w:type="spellStart"/>
+      <w:r>
+        <w:t>thư</w:t>
+      </w:r>
+      <w:proofErr w:type="spellEnd"/>
+      <w:r>
+        <w:t xml:space="preserve"> </w:t>
+      </w:r>
+      <w:proofErr w:type="spellStart"/>
+      <w:r>
+        <w:t>mục</w:t>
+      </w:r>
+      <w:proofErr w:type="spellEnd"/>
+      <w:r>
+        <w:t xml:space="preserve"> </w:t>
+      </w:r>
+      <w:proofErr w:type="spellStart"/>
+      <w:r>
+        <w:t>chứa</w:t>
+      </w:r>
+      <w:proofErr w:type="spellEnd"/>
+      <w:r>
+        <w:t xml:space="preserve"> </w:t>
+      </w:r>
+      <w:proofErr w:type="spellStart"/>
+      <w:r>
+        <w:t>thông</w:t>
+      </w:r>
+      <w:proofErr w:type="spellEnd"/>
+      <w:r>
+        <w:t xml:space="preserve"> tin </w:t>
+      </w:r>
+      <w:proofErr w:type="spellStart"/>
+      <w:r>
+        <w:t>của</w:t>
+      </w:r>
+      <w:proofErr w:type="spellEnd"/>
+      <w:r>
+        <w:t xml:space="preserve"> </w:t>
+      </w:r>
+      <w:proofErr w:type="spellStart"/>
+      <w:r>
+        <w:t>thư</w:t>
+      </w:r>
+      <w:proofErr w:type="spellEnd"/>
+      <w:r>
+        <w:t xml:space="preserve"> </w:t>
+      </w:r>
+      <w:proofErr w:type="spellStart"/>
+      <w:r>
+        <w:t>viện</w:t>
+      </w:r>
+      <w:proofErr w:type="spellEnd"/>
+      <w:r>
+        <w:t xml:space="preserve">, </w:t>
+      </w:r>
+      <w:proofErr w:type="spellStart"/>
+      <w:r>
+        <w:t>không</w:t>
+      </w:r>
+      <w:proofErr w:type="spellEnd"/>
+      <w:r>
+        <w:t xml:space="preserve"> </w:t>
+      </w:r>
+      <w:proofErr w:type="spellStart"/>
+      <w:r>
+        <w:t>cần</w:t>
+      </w:r>
+      <w:proofErr w:type="spellEnd"/>
+      <w:r>
+        <w:t xml:space="preserve"> copy.</w:t>
       </w:r>
     </w:p>
     <w:p>
       <w:r>
         <w:lastRenderedPageBreak/>
-        <w:t>Sau đó tạo file `setup.py`:</w:t>
+        <w:t xml:space="preserve">Sau </w:t>
+      </w:r>
+      <w:proofErr w:type="spellStart"/>
+      <w:r>
+        <w:t>đó</w:t>
+      </w:r>
+      <w:proofErr w:type="spellEnd"/>
+      <w:r>
+        <w:t xml:space="preserve"> </w:t>
+      </w:r>
+      <w:proofErr w:type="spellStart"/>
+      <w:r>
+        <w:t>tạo</w:t>
+      </w:r>
+      <w:proofErr w:type="spellEnd"/>
+      <w:r>
+        <w:t xml:space="preserve"> file `setup.py`:</w:t>
       </w:r>
     </w:p>
     <w:p>
       <w:r>
+        <w:rPr>
+          <w:noProof/>
+        </w:rPr>
         <w:drawing>
           <wp:inline distT="0" distB="0" distL="0" distR="0" wp14:anchorId="6DC2E289" wp14:editId="44B612FA">
             <wp:extent cx="5943600" cy="3138805"/>
@@ -147,12 +494,148 @@
     </w:p>
     <w:p>
       <w:r>
-        <w:t>Trong đó cần quan tâm 1 số dữ liệu như mình đã comment trong code.</w:t>
+        <w:t xml:space="preserve">Trong </w:t>
+      </w:r>
+      <w:proofErr w:type="spellStart"/>
+      <w:r>
+        <w:t>đó</w:t>
+      </w:r>
+      <w:proofErr w:type="spellEnd"/>
+      <w:r>
+        <w:t xml:space="preserve"> </w:t>
+      </w:r>
+      <w:proofErr w:type="spellStart"/>
+      <w:r>
+        <w:t>cần</w:t>
+      </w:r>
+      <w:proofErr w:type="spellEnd"/>
+      <w:r>
+        <w:t xml:space="preserve"> </w:t>
+      </w:r>
+      <w:proofErr w:type="spellStart"/>
+      <w:r>
+        <w:t>quan</w:t>
+      </w:r>
+      <w:proofErr w:type="spellEnd"/>
+      <w:r>
+        <w:t xml:space="preserve"> </w:t>
+      </w:r>
+      <w:proofErr w:type="spellStart"/>
+      <w:r>
+        <w:t>tâm</w:t>
+      </w:r>
+      <w:proofErr w:type="spellEnd"/>
+      <w:r>
+        <w:t xml:space="preserve"> 1 </w:t>
+      </w:r>
+      <w:proofErr w:type="spellStart"/>
+      <w:r>
+        <w:t>số</w:t>
+      </w:r>
+      <w:proofErr w:type="spellEnd"/>
+      <w:r>
+        <w:t xml:space="preserve"> </w:t>
+      </w:r>
+      <w:proofErr w:type="spellStart"/>
+      <w:r>
+        <w:t>dữ</w:t>
+      </w:r>
+      <w:proofErr w:type="spellEnd"/>
+      <w:r>
+        <w:t xml:space="preserve"> </w:t>
+      </w:r>
+      <w:proofErr w:type="spellStart"/>
+      <w:r>
+        <w:t>liệu</w:t>
+      </w:r>
+      <w:proofErr w:type="spellEnd"/>
+      <w:r>
+        <w:t xml:space="preserve"> </w:t>
+      </w:r>
+      <w:proofErr w:type="spellStart"/>
+      <w:r>
+        <w:t>như</w:t>
+      </w:r>
+      <w:proofErr w:type="spellEnd"/>
+      <w:r>
+        <w:t xml:space="preserve"> </w:t>
+      </w:r>
+      <w:proofErr w:type="spellStart"/>
+      <w:r>
+        <w:t>mình</w:t>
+      </w:r>
+      <w:proofErr w:type="spellEnd"/>
+      <w:r>
+        <w:t xml:space="preserve"> </w:t>
+      </w:r>
+      <w:proofErr w:type="spellStart"/>
+      <w:r>
+        <w:t>đã</w:t>
+      </w:r>
+      <w:proofErr w:type="spellEnd"/>
+      <w:r>
+        <w:t xml:space="preserve"> comment </w:t>
+      </w:r>
+      <w:proofErr w:type="spellStart"/>
+      <w:r>
+        <w:t>trong</w:t>
+      </w:r>
+      <w:proofErr w:type="spellEnd"/>
+      <w:r>
+        <w:t xml:space="preserve"> code.</w:t>
       </w:r>
     </w:p>
     <w:p>
       <w:r>
-        <w:t>Sau đó cài đặt whell bằng lệnh `</w:t>
+        <w:t xml:space="preserve">Sau </w:t>
+      </w:r>
+      <w:proofErr w:type="spellStart"/>
+      <w:r>
+        <w:t>đó</w:t>
+      </w:r>
+      <w:proofErr w:type="spellEnd"/>
+      <w:r>
+        <w:t xml:space="preserve"> </w:t>
+      </w:r>
+      <w:proofErr w:type="spellStart"/>
+      <w:r>
+        <w:t>cài</w:t>
+      </w:r>
+      <w:proofErr w:type="spellEnd"/>
+      <w:r>
+        <w:t xml:space="preserve"> </w:t>
+      </w:r>
+      <w:proofErr w:type="spellStart"/>
+      <w:r>
+        <w:t>đặt</w:t>
+      </w:r>
+      <w:proofErr w:type="spellEnd"/>
+      <w:r>
+        <w:t xml:space="preserve"> </w:t>
+      </w:r>
+      <w:proofErr w:type="spellStart"/>
+      <w:r>
+        <w:t>whell</w:t>
+      </w:r>
+      <w:proofErr w:type="spellEnd"/>
+      <w:r>
+        <w:t xml:space="preserve"> </w:t>
+      </w:r>
+      <w:proofErr w:type="spellStart"/>
+      <w:r>
+        <w:t>bằng</w:t>
+      </w:r>
+      <w:proofErr w:type="spellEnd"/>
+      <w:r>
+        <w:t xml:space="preserve"> </w:t>
+      </w:r>
+      <w:proofErr w:type="spellStart"/>
+      <w:r>
+        <w:t>lệnh</w:t>
+      </w:r>
+      <w:proofErr w:type="spellEnd"/>
+      <w:r>
+        <w:t xml:space="preserve"> `</w:t>
       </w:r>
       <w:r>
         <w:t>pip install wheel</w:t>
@@ -163,17 +646,110 @@
     </w:p>
     <w:p>
       <w:r>
-        <w:t>Sau đó chạy lệnh `</w:t>
-      </w:r>
-      <w:r>
-        <w:t>python setup.py sdist bdist_wheel</w:t>
-      </w:r>
-      <w:r>
-        <w:t>` để đóng gói lại thưu viện này</w:t>
-      </w:r>
+        <w:t xml:space="preserve">Sau </w:t>
+      </w:r>
+      <w:proofErr w:type="spellStart"/>
+      <w:r>
+        <w:t>đó</w:t>
+      </w:r>
+      <w:proofErr w:type="spellEnd"/>
+      <w:r>
+        <w:t xml:space="preserve"> </w:t>
+      </w:r>
+      <w:proofErr w:type="spellStart"/>
+      <w:r>
+        <w:t>chạy</w:t>
+      </w:r>
+      <w:proofErr w:type="spellEnd"/>
+      <w:r>
+        <w:t xml:space="preserve"> </w:t>
+      </w:r>
+      <w:proofErr w:type="spellStart"/>
+      <w:r>
+        <w:t>lệnh</w:t>
+      </w:r>
+      <w:proofErr w:type="spellEnd"/>
+      <w:r>
+        <w:t xml:space="preserve"> `</w:t>
+      </w:r>
+      <w:r>
+        <w:t xml:space="preserve">python setup.py </w:t>
+      </w:r>
+      <w:proofErr w:type="spellStart"/>
+      <w:r>
+        <w:t>sdist</w:t>
+      </w:r>
+      <w:proofErr w:type="spellEnd"/>
+      <w:r>
+        <w:t xml:space="preserve"> </w:t>
+      </w:r>
+      <w:proofErr w:type="spellStart"/>
+      <w:r>
+        <w:t>bdist_wheel</w:t>
+      </w:r>
+      <w:proofErr w:type="spellEnd"/>
+      <w:r>
+        <w:t xml:space="preserve">` </w:t>
+      </w:r>
+      <w:proofErr w:type="spellStart"/>
+      <w:r>
+        <w:t>để</w:t>
+      </w:r>
+      <w:proofErr w:type="spellEnd"/>
+      <w:r>
+        <w:t xml:space="preserve"> </w:t>
+      </w:r>
+      <w:proofErr w:type="spellStart"/>
+      <w:r>
+        <w:t>đóng</w:t>
+      </w:r>
+      <w:proofErr w:type="spellEnd"/>
+      <w:r>
+        <w:t xml:space="preserve"> </w:t>
+      </w:r>
+      <w:proofErr w:type="spellStart"/>
+      <w:r>
+        <w:t>gói</w:t>
+      </w:r>
+      <w:proofErr w:type="spellEnd"/>
+      <w:r>
+        <w:t xml:space="preserve"> </w:t>
+      </w:r>
+      <w:proofErr w:type="spellStart"/>
+      <w:r>
+        <w:t>lại</w:t>
+      </w:r>
+      <w:proofErr w:type="spellEnd"/>
+      <w:r>
+        <w:t xml:space="preserve"> </w:t>
+      </w:r>
+      <w:proofErr w:type="spellStart"/>
+      <w:r>
+        <w:t>thư</w:t>
+      </w:r>
+      <w:proofErr w:type="spellEnd"/>
+      <w:r>
+        <w:t xml:space="preserve"> </w:t>
+      </w:r>
+      <w:proofErr w:type="spellStart"/>
+      <w:r>
+        <w:t>viện</w:t>
+      </w:r>
+      <w:proofErr w:type="spellEnd"/>
+      <w:r>
+        <w:t xml:space="preserve"> </w:t>
+      </w:r>
+      <w:proofErr w:type="spellStart"/>
+      <w:r>
+        <w:t>này</w:t>
+      </w:r>
+      <w:proofErr w:type="spellEnd"/>
     </w:p>
     <w:p>
       <w:r>
+        <w:rPr>
+          <w:noProof/>
+        </w:rPr>
         <w:lastRenderedPageBreak/>
         <w:drawing>
           <wp:inline distT="0" distB="0" distL="0" distR="0" wp14:anchorId="36B055BD" wp14:editId="614ABF04">
@@ -213,19 +789,245 @@
       </w:r>
     </w:p>
     <w:p>
-      <w:r>
-        <w:t>Nó sẽ cho ra 3 thư mục `</w:t>
-      </w:r>
-      <w:r>
-        <w:t>acbcontroller.egg-info</w:t>
-      </w:r>
-      <w:r>
-        <w:t>`, `build` và `dist`. Cái ta cần quan tâm là thư mục `dist`. Lưu nó lại và di chuyển đến dự án cần cài thư viện này</w:t>
-      </w:r>
+      <w:proofErr w:type="spellStart"/>
+      <w:r>
+        <w:t>Nó</w:t>
+      </w:r>
+      <w:proofErr w:type="spellEnd"/>
+      <w:r>
+        <w:t xml:space="preserve"> </w:t>
+      </w:r>
+      <w:proofErr w:type="spellStart"/>
+      <w:r>
+        <w:t>sẽ</w:t>
+      </w:r>
+      <w:proofErr w:type="spellEnd"/>
+      <w:r>
+        <w:t xml:space="preserve"> </w:t>
+      </w:r>
+      <w:proofErr w:type="spellStart"/>
+      <w:r>
+        <w:t>cho</w:t>
+      </w:r>
+      <w:proofErr w:type="spellEnd"/>
+      <w:r>
+        <w:t xml:space="preserve"> </w:t>
+      </w:r>
+      <w:proofErr w:type="spellStart"/>
+      <w:r>
+        <w:t>ra</w:t>
+      </w:r>
+      <w:proofErr w:type="spellEnd"/>
+      <w:r>
+        <w:t xml:space="preserve"> 3 </w:t>
+      </w:r>
+      <w:proofErr w:type="spellStart"/>
+      <w:r>
+        <w:t>thư</w:t>
+      </w:r>
+      <w:proofErr w:type="spellEnd"/>
+      <w:r>
+        <w:t xml:space="preserve"> </w:t>
+      </w:r>
+      <w:proofErr w:type="spellStart"/>
+      <w:r>
+        <w:t>mục</w:t>
+      </w:r>
+      <w:proofErr w:type="spellEnd"/>
+      <w:r>
+        <w:t xml:space="preserve"> `</w:t>
+      </w:r>
+      <w:proofErr w:type="spellStart"/>
+      <w:r>
+        <w:t>acbcontroller.egg</w:t>
+      </w:r>
+      <w:proofErr w:type="spellEnd"/>
+      <w:r>
+        <w:t>-info</w:t>
+      </w:r>
+      <w:r>
+        <w:t xml:space="preserve">`, `build` </w:t>
+      </w:r>
+      <w:proofErr w:type="spellStart"/>
+      <w:r>
+        <w:t>và</w:t>
+      </w:r>
+      <w:proofErr w:type="spellEnd"/>
+      <w:r>
+        <w:t xml:space="preserve"> `</w:t>
+      </w:r>
+      <w:proofErr w:type="spellStart"/>
+      <w:r>
+        <w:t>dist</w:t>
+      </w:r>
+      <w:proofErr w:type="spellEnd"/>
+      <w:r>
+        <w:t xml:space="preserve">`. </w:t>
+      </w:r>
+      <w:proofErr w:type="spellStart"/>
+      <w:r>
+        <w:t>Cái</w:t>
+      </w:r>
+      <w:proofErr w:type="spellEnd"/>
+      <w:r>
+        <w:t xml:space="preserve"> ta </w:t>
+      </w:r>
+      <w:proofErr w:type="spellStart"/>
+      <w:r>
+        <w:t>cần</w:t>
+      </w:r>
+      <w:proofErr w:type="spellEnd"/>
+      <w:r>
+        <w:t xml:space="preserve"> </w:t>
+      </w:r>
+      <w:proofErr w:type="spellStart"/>
+      <w:r>
+        <w:t>quan</w:t>
+      </w:r>
+      <w:proofErr w:type="spellEnd"/>
+      <w:r>
+        <w:t xml:space="preserve"> </w:t>
+      </w:r>
+      <w:proofErr w:type="spellStart"/>
+      <w:r>
+        <w:t>tâm</w:t>
+      </w:r>
+      <w:proofErr w:type="spellEnd"/>
+      <w:r>
+        <w:t xml:space="preserve"> </w:t>
+      </w:r>
+      <w:proofErr w:type="spellStart"/>
+      <w:r>
+        <w:t>là</w:t>
+      </w:r>
+      <w:proofErr w:type="spellEnd"/>
+      <w:r>
+        <w:t xml:space="preserve"> </w:t>
+      </w:r>
+      <w:proofErr w:type="spellStart"/>
+      <w:r>
+        <w:t>thư</w:t>
+      </w:r>
+      <w:proofErr w:type="spellEnd"/>
+      <w:r>
+        <w:t xml:space="preserve"> </w:t>
+      </w:r>
+      <w:proofErr w:type="spellStart"/>
+      <w:r>
+        <w:t>mục</w:t>
+      </w:r>
+      <w:proofErr w:type="spellEnd"/>
+      <w:r>
+        <w:t xml:space="preserve"> `</w:t>
+      </w:r>
+      <w:proofErr w:type="spellStart"/>
+      <w:r>
+        <w:t>dist</w:t>
+      </w:r>
+      <w:proofErr w:type="spellEnd"/>
+      <w:r>
+        <w:t xml:space="preserve">`. Lưu </w:t>
+      </w:r>
+      <w:proofErr w:type="spellStart"/>
+      <w:r>
+        <w:t>nó</w:t>
+      </w:r>
+      <w:proofErr w:type="spellEnd"/>
+      <w:r>
+        <w:t xml:space="preserve"> </w:t>
+      </w:r>
+      <w:proofErr w:type="spellStart"/>
+      <w:r>
+        <w:t>lại</w:t>
+      </w:r>
+      <w:proofErr w:type="spellEnd"/>
+      <w:r>
+        <w:t xml:space="preserve"> </w:t>
+      </w:r>
+      <w:proofErr w:type="spellStart"/>
+      <w:r>
+        <w:t>và</w:t>
+      </w:r>
+      <w:proofErr w:type="spellEnd"/>
+      <w:r>
+        <w:t xml:space="preserve"> di </w:t>
+      </w:r>
+      <w:proofErr w:type="spellStart"/>
+      <w:r>
+        <w:t>chuyển</w:t>
+      </w:r>
+      <w:proofErr w:type="spellEnd"/>
+      <w:r>
+        <w:t xml:space="preserve"> </w:t>
+      </w:r>
+      <w:proofErr w:type="spellStart"/>
+      <w:r>
+        <w:t>đến</w:t>
+      </w:r>
+      <w:proofErr w:type="spellEnd"/>
+      <w:r>
+        <w:t xml:space="preserve"> </w:t>
+      </w:r>
+      <w:proofErr w:type="spellStart"/>
+      <w:r>
+        <w:t>dự</w:t>
+      </w:r>
+      <w:proofErr w:type="spellEnd"/>
+      <w:r>
+        <w:t xml:space="preserve"> </w:t>
+      </w:r>
+      <w:proofErr w:type="spellStart"/>
+      <w:r>
+        <w:t>án</w:t>
+      </w:r>
+      <w:proofErr w:type="spellEnd"/>
+      <w:r>
+        <w:t xml:space="preserve"> </w:t>
+      </w:r>
+      <w:proofErr w:type="spellStart"/>
+      <w:r>
+        <w:t>cần</w:t>
+      </w:r>
+      <w:proofErr w:type="spellEnd"/>
+      <w:r>
+        <w:t xml:space="preserve"> </w:t>
+      </w:r>
+      <w:proofErr w:type="spellStart"/>
+      <w:r>
+        <w:t>cài</w:t>
+      </w:r>
+      <w:proofErr w:type="spellEnd"/>
+      <w:r>
+        <w:t xml:space="preserve"> </w:t>
+      </w:r>
+      <w:proofErr w:type="spellStart"/>
+      <w:r>
+        <w:t>thư</w:t>
+      </w:r>
+      <w:proofErr w:type="spellEnd"/>
+      <w:r>
+        <w:t xml:space="preserve"> </w:t>
+      </w:r>
+      <w:proofErr w:type="spellStart"/>
+      <w:r>
+        <w:t>viện</w:t>
+      </w:r>
+      <w:proofErr w:type="spellEnd"/>
+      <w:r>
+        <w:t xml:space="preserve"> </w:t>
+      </w:r>
+      <w:proofErr w:type="spellStart"/>
+      <w:r>
+        <w:t>này</w:t>
+      </w:r>
+      <w:proofErr w:type="spellEnd"/>
     </w:p>
     <w:p/>
     <w:p>
       <w:r>
+        <w:rPr>
+          <w:noProof/>
+        </w:rPr>
         <w:lastRenderedPageBreak/>
         <w:drawing>
           <wp:inline distT="0" distB="0" distL="0" distR="0" wp14:anchorId="183EFCBE" wp14:editId="7CC6DF95">
@@ -265,20 +1067,179 @@
       </w:r>
     </w:p>
     <w:p>
-      <w:r>
-        <w:t>Chạy lệnh cài đặt bằng câu sau: `pip install path/to/.whl`. Ví dụ với thư mục dự án này</w:t>
-      </w:r>
+      <w:proofErr w:type="spellStart"/>
+      <w:r>
+        <w:t>Chạy</w:t>
+      </w:r>
+      <w:proofErr w:type="spellEnd"/>
+      <w:r>
+        <w:t xml:space="preserve"> </w:t>
+      </w:r>
+      <w:proofErr w:type="spellStart"/>
+      <w:r>
+        <w:t>lệnh</w:t>
+      </w:r>
+      <w:proofErr w:type="spellEnd"/>
+      <w:r>
+        <w:t xml:space="preserve"> </w:t>
+      </w:r>
+      <w:proofErr w:type="spellStart"/>
+      <w:r>
+        <w:t>cài</w:t>
+      </w:r>
+      <w:proofErr w:type="spellEnd"/>
+      <w:r>
+        <w:t xml:space="preserve"> </w:t>
+      </w:r>
+      <w:proofErr w:type="spellStart"/>
+      <w:r>
+        <w:t>đặt</w:t>
+      </w:r>
+      <w:proofErr w:type="spellEnd"/>
+      <w:r>
+        <w:t xml:space="preserve"> </w:t>
+      </w:r>
+      <w:proofErr w:type="spellStart"/>
+      <w:r>
+        <w:t>bằng</w:t>
+      </w:r>
+      <w:proofErr w:type="spellEnd"/>
+      <w:r>
+        <w:t xml:space="preserve"> </w:t>
+      </w:r>
+      <w:proofErr w:type="spellStart"/>
+      <w:r>
+        <w:t>câu</w:t>
+      </w:r>
+      <w:proofErr w:type="spellEnd"/>
+      <w:r>
+        <w:t xml:space="preserve"> </w:t>
+      </w:r>
+      <w:proofErr w:type="spellStart"/>
+      <w:r>
+        <w:t>sau</w:t>
+      </w:r>
+      <w:proofErr w:type="spellEnd"/>
+      <w:r>
+        <w:t>: `pip install path/to/.</w:t>
+      </w:r>
+      <w:proofErr w:type="spellStart"/>
+      <w:r>
+        <w:t>whl</w:t>
+      </w:r>
+      <w:proofErr w:type="spellEnd"/>
+      <w:r>
+        <w:t xml:space="preserve">`. </w:t>
+      </w:r>
+      <w:proofErr w:type="spellStart"/>
+      <w:r>
+        <w:t>Ví</w:t>
+      </w:r>
+      <w:proofErr w:type="spellEnd"/>
+      <w:r>
+        <w:t xml:space="preserve"> </w:t>
+      </w:r>
+      <w:proofErr w:type="spellStart"/>
+      <w:r>
+        <w:t>dụ</w:t>
+      </w:r>
+      <w:proofErr w:type="spellEnd"/>
+      <w:r>
+        <w:t xml:space="preserve"> </w:t>
+      </w:r>
+      <w:proofErr w:type="spellStart"/>
+      <w:r>
+        <w:t>với</w:t>
+      </w:r>
+      <w:proofErr w:type="spellEnd"/>
+      <w:r>
+        <w:t xml:space="preserve"> </w:t>
+      </w:r>
+      <w:proofErr w:type="spellStart"/>
+      <w:r>
+        <w:t>thư</w:t>
+      </w:r>
+      <w:proofErr w:type="spellEnd"/>
+      <w:r>
+        <w:t xml:space="preserve"> </w:t>
+      </w:r>
+      <w:proofErr w:type="spellStart"/>
+      <w:r>
+        <w:t>mục</w:t>
+      </w:r>
+      <w:proofErr w:type="spellEnd"/>
+      <w:r>
+        <w:t xml:space="preserve"> </w:t>
+      </w:r>
+      <w:proofErr w:type="spellStart"/>
+      <w:r>
+        <w:t>dự</w:t>
+      </w:r>
+      <w:proofErr w:type="spellEnd"/>
+      <w:r>
+        <w:t xml:space="preserve"> </w:t>
+      </w:r>
+      <w:proofErr w:type="spellStart"/>
+      <w:r>
+        <w:t>án</w:t>
+      </w:r>
+      <w:proofErr w:type="spellEnd"/>
+      <w:r>
+        <w:t xml:space="preserve"> </w:t>
+      </w:r>
+      <w:proofErr w:type="spellStart"/>
+      <w:r>
+        <w:t>này</w:t>
+      </w:r>
+      <w:proofErr w:type="spellEnd"/>
     </w:p>
     <w:p>
       <w:r>
         <w:t>`</w:t>
       </w:r>
       <w:r>
-        <w:t>pip install controller\dist\uhppoted-0.8.9-py3-none-any.whl</w:t>
-      </w:r>
-      <w:r>
-        <w:t>` cài đặt và dùng</w:t>
-      </w:r>
+        <w:t>pip install controller\</w:t>
+      </w:r>
+      <w:proofErr w:type="spellStart"/>
+      <w:r>
+        <w:t>dist</w:t>
+      </w:r>
+      <w:proofErr w:type="spellEnd"/>
+      <w:r>
+        <w:t>\uhppoted-0.8.9-py3-none-any.whl</w:t>
+      </w:r>
+      <w:r>
+        <w:t xml:space="preserve">` </w:t>
+      </w:r>
+      <w:proofErr w:type="spellStart"/>
+      <w:r>
+        <w:t>cài</w:t>
+      </w:r>
+      <w:proofErr w:type="spellEnd"/>
+      <w:r>
+        <w:t xml:space="preserve"> </w:t>
+      </w:r>
+      <w:proofErr w:type="spellStart"/>
+      <w:r>
+        <w:t>đặt</w:t>
+      </w:r>
+      <w:proofErr w:type="spellEnd"/>
+      <w:r>
+        <w:t xml:space="preserve"> </w:t>
+      </w:r>
+      <w:proofErr w:type="spellStart"/>
+      <w:r>
+        <w:t>và</w:t>
+      </w:r>
+      <w:proofErr w:type="spellEnd"/>
+      <w:r>
+        <w:t xml:space="preserve"> </w:t>
+      </w:r>
+      <w:proofErr w:type="spellStart"/>
+      <w:r>
+        <w:t>dùng</w:t>
+      </w:r>
+      <w:proofErr w:type="spellEnd"/>
     </w:p>
     <w:sectPr>
       <w:pgSz w:w="12240" w:h="15840"/>

</xml_diff>